<commit_message>
Update resume files and link
</commit_message>
<xml_diff>
--- a/public/saranya_resume.docx
+++ b/public/saranya_resume.docx
@@ -64,36 +64,8 @@
             <w:sz w:val="18"/>
             <w:szCs w:val="18"/>
           </w:rPr>
-          <w:t xml:space="preserve">LinkedIn: </w:t>
+          <w:t>LinkedIn: saranya srija</w:t>
         </w:r>
-        <w:proofErr w:type="spellStart"/>
-        <w:r>
-          <w:rPr>
-            <w:rStyle w:val="Hyperlink"/>
-            <w:sz w:val="18"/>
-            <w:szCs w:val="18"/>
-          </w:rPr>
-          <w:t>saranya</w:t>
-        </w:r>
-        <w:proofErr w:type="spellEnd"/>
-        <w:r>
-          <w:rPr>
-            <w:rStyle w:val="Hyperlink"/>
-            <w:sz w:val="18"/>
-            <w:szCs w:val="18"/>
-          </w:rPr>
-          <w:t xml:space="preserve"> </w:t>
-        </w:r>
-        <w:proofErr w:type="spellStart"/>
-        <w:r>
-          <w:rPr>
-            <w:rStyle w:val="Hyperlink"/>
-            <w:sz w:val="18"/>
-            <w:szCs w:val="18"/>
-          </w:rPr>
-          <w:t>srija</w:t>
-        </w:r>
-        <w:proofErr w:type="spellEnd"/>
       </w:hyperlink>
       <w:r>
         <w:rPr>
@@ -110,18 +82,19 @@
             <w:sz w:val="18"/>
             <w:szCs w:val="18"/>
           </w:rPr>
-          <w:t xml:space="preserve">GitHub: </w:t>
+          <w:t>GitHub: saranbud</w:t>
         </w:r>
-        <w:proofErr w:type="spellStart"/>
+      </w:hyperlink>
+      <w:r>
+        <w:t xml:space="preserve"> | </w:t>
+      </w:r>
+      <w:hyperlink r:id="rId10" w:history="1">
         <w:r>
           <w:rPr>
             <w:rStyle w:val="Hyperlink"/>
-            <w:sz w:val="18"/>
-            <w:szCs w:val="18"/>
           </w:rPr>
-          <w:t>saranbud</w:t>
+          <w:t>Portfolio site</w:t>
         </w:r>
-        <w:proofErr w:type="spellEnd"/>
       </w:hyperlink>
     </w:p>
     <w:p>
@@ -194,17 +167,7 @@
           <w:sz w:val="21"/>
           <w:szCs w:val="21"/>
         </w:rPr>
-        <w:t xml:space="preserve">Data Analyst </w:t>
-      </w:r>
-      <w:proofErr w:type="gramStart"/>
-      <w:r>
-        <w:rPr>
-          <w:b/>
-          <w:bCs/>
-          <w:sz w:val="21"/>
-          <w:szCs w:val="21"/>
-        </w:rPr>
-        <w:t>Intern</w:t>
+        <w:t>Data Analyst Intern</w:t>
       </w:r>
       <w:r>
         <w:rPr>
@@ -212,16 +175,7 @@
           <w:sz w:val="21"/>
           <w:szCs w:val="21"/>
         </w:rPr>
-        <w:t xml:space="preserve">  |</w:t>
-      </w:r>
-      <w:proofErr w:type="gramEnd"/>
-      <w:r>
-        <w:rPr>
-          <w:color w:val="888888"/>
-          <w:sz w:val="21"/>
-          <w:szCs w:val="21"/>
-        </w:rPr>
-        <w:t xml:space="preserve">  </w:t>
+        <w:t xml:space="preserve">  |  </w:t>
       </w:r>
       <w:r>
         <w:rPr>
@@ -231,31 +185,13 @@
           <w:sz w:val="21"/>
           <w:szCs w:val="21"/>
         </w:rPr>
-        <w:t xml:space="preserve">KATBOTZ </w:t>
-      </w:r>
-      <w:proofErr w:type="gramStart"/>
-      <w:r>
-        <w:rPr>
-          <w:b/>
-          <w:bCs/>
-          <w:color w:val="1A5276"/>
-          <w:sz w:val="21"/>
-          <w:szCs w:val="21"/>
-        </w:rPr>
-        <w:t>LLC</w:t>
+        <w:t>KATBOTZ LLC</w:t>
       </w:r>
       <w:r>
         <w:rPr>
           <w:color w:val="555555"/>
         </w:rPr>
-        <w:t xml:space="preserve">  —</w:t>
-      </w:r>
-      <w:proofErr w:type="gramEnd"/>
-      <w:r>
-        <w:rPr>
-          <w:color w:val="555555"/>
-        </w:rPr>
-        <w:t xml:space="preserve">  Bridgewater, NJ</w:t>
+        <w:t xml:space="preserve">  —  Bridgewater, NJ</w:t>
       </w:r>
       <w:r>
         <w:rPr>
@@ -283,39 +219,7 @@
           <w:sz w:val="19"/>
           <w:szCs w:val="19"/>
         </w:rPr>
-        <w:t>Developed and deployed an FP&amp;A Co-</w:t>
-      </w:r>
-      <w:proofErr w:type="gramStart"/>
-      <w:r>
-        <w:rPr>
-          <w:sz w:val="19"/>
-          <w:szCs w:val="19"/>
-        </w:rPr>
-        <w:t>Pilot ,</w:t>
-      </w:r>
-      <w:proofErr w:type="gramEnd"/>
-      <w:r>
-        <w:rPr>
-          <w:sz w:val="19"/>
-          <w:szCs w:val="19"/>
-        </w:rPr>
-        <w:t xml:space="preserve"> a conversational AI agent on Databricks </w:t>
-      </w:r>
-      <w:proofErr w:type="gramStart"/>
-      <w:r>
-        <w:rPr>
-          <w:sz w:val="19"/>
-          <w:szCs w:val="19"/>
-        </w:rPr>
-        <w:t>Apps ,</w:t>
-      </w:r>
-      <w:proofErr w:type="gramEnd"/>
-      <w:r>
-        <w:rPr>
-          <w:sz w:val="19"/>
-          <w:szCs w:val="19"/>
-        </w:rPr>
-        <w:t xml:space="preserve"> enabling non-technical users to query financial data in plain English using a Llama 3.3 70B model with 8 specialized analytical tools (forecasting, variance analysis, trend detection).</w:t>
+        <w:t>Developed and deployed an FP&amp;A Co-Pilot , a conversational AI agent on Databricks Apps , enabling non-technical users to query financial data in plain English using a Llama 3.3 70B model with 8 specialized analytical tools (forecasting, variance analysis, trend detection).</w:t>
       </w:r>
     </w:p>
     <w:p>
@@ -332,23 +236,7 @@
           <w:sz w:val="19"/>
           <w:szCs w:val="19"/>
         </w:rPr>
-        <w:t xml:space="preserve">Wrote and optimized SQL queries in Databricks to </w:t>
-      </w:r>
-      <w:proofErr w:type="spellStart"/>
-      <w:r>
-        <w:rPr>
-          <w:sz w:val="19"/>
-          <w:szCs w:val="19"/>
-        </w:rPr>
-        <w:t>analyze</w:t>
-      </w:r>
-      <w:proofErr w:type="spellEnd"/>
-      <w:r>
-        <w:rPr>
-          <w:sz w:val="19"/>
-          <w:szCs w:val="19"/>
-        </w:rPr>
-        <w:t xml:space="preserve"> SAP S/4HANA financial data (100K+ records), reducing query execution time by 30% and enabling faster KPI tracking.</w:t>
+        <w:t>Wrote and optimized SQL queries in Databricks to analyze SAP S/4HANA financial data (100K+ records), reducing query execution time by 30% and enabling faster KPI tracking.</w:t>
       </w:r>
     </w:p>
     <w:p>
@@ -382,23 +270,7 @@
           <w:sz w:val="19"/>
           <w:szCs w:val="19"/>
         </w:rPr>
-        <w:t xml:space="preserve">Architected SAP S/4HANA to Databricks integration via SAP Business Data Cloud (BDC) using Delta Sharing protocol; set up Unity </w:t>
-      </w:r>
-      <w:proofErr w:type="spellStart"/>
-      <w:r>
-        <w:rPr>
-          <w:sz w:val="19"/>
-          <w:szCs w:val="19"/>
-        </w:rPr>
-        <w:t>Catalog</w:t>
-      </w:r>
-      <w:proofErr w:type="spellEnd"/>
-      <w:r>
-        <w:rPr>
-          <w:sz w:val="19"/>
-          <w:szCs w:val="19"/>
-        </w:rPr>
-        <w:t xml:space="preserve"> with full governance and validated the end-to-end pipeline.</w:t>
+        <w:t>Architected SAP S/4HANA to Databricks integration via SAP Business Data Cloud (BDC) using Delta Sharing protocol; set up Unity Catalog with full governance and validated the end-to-end pipeline.</w:t>
       </w:r>
     </w:p>
     <w:p>
@@ -415,17 +287,7 @@
           <w:sz w:val="21"/>
           <w:szCs w:val="21"/>
         </w:rPr>
-        <w:t xml:space="preserve">Data Analyst </w:t>
-      </w:r>
-      <w:proofErr w:type="gramStart"/>
-      <w:r>
-        <w:rPr>
-          <w:b/>
-          <w:bCs/>
-          <w:sz w:val="21"/>
-          <w:szCs w:val="21"/>
-        </w:rPr>
-        <w:t>Intern</w:t>
+        <w:t>Data Analyst Intern</w:t>
       </w:r>
       <w:r>
         <w:rPr>
@@ -433,18 +295,8 @@
           <w:sz w:val="21"/>
           <w:szCs w:val="21"/>
         </w:rPr>
-        <w:t xml:space="preserve">  |</w:t>
-      </w:r>
-      <w:proofErr w:type="gramEnd"/>
-      <w:r>
-        <w:rPr>
-          <w:color w:val="888888"/>
-          <w:sz w:val="21"/>
-          <w:szCs w:val="21"/>
-        </w:rPr>
-        <w:t xml:space="preserve">  </w:t>
-      </w:r>
-      <w:proofErr w:type="spellStart"/>
+        <w:t xml:space="preserve">  |  </w:t>
+      </w:r>
       <w:r>
         <w:rPr>
           <w:b/>
@@ -453,42 +305,13 @@
           <w:sz w:val="21"/>
           <w:szCs w:val="21"/>
         </w:rPr>
-        <w:t>Datagaps</w:t>
-      </w:r>
-      <w:proofErr w:type="spellEnd"/>
-      <w:r>
-        <w:rPr>
-          <w:b/>
-          <w:bCs/>
-          <w:color w:val="1A5276"/>
-          <w:sz w:val="21"/>
-          <w:szCs w:val="21"/>
-        </w:rPr>
-        <w:t xml:space="preserve"> &amp; </w:t>
-      </w:r>
-      <w:proofErr w:type="gramStart"/>
-      <w:r>
-        <w:rPr>
-          <w:b/>
-          <w:bCs/>
-          <w:color w:val="1A5276"/>
-          <w:sz w:val="21"/>
-          <w:szCs w:val="21"/>
-        </w:rPr>
-        <w:t>FocalCXM</w:t>
+        <w:t>Datagaps &amp; FocalCXM</w:t>
       </w:r>
       <w:r>
         <w:rPr>
           <w:color w:val="555555"/>
         </w:rPr>
-        <w:t xml:space="preserve">  —</w:t>
-      </w:r>
-      <w:proofErr w:type="gramEnd"/>
-      <w:r>
-        <w:rPr>
-          <w:color w:val="555555"/>
-        </w:rPr>
-        <w:t xml:space="preserve">  Herndon, VA</w:t>
+        <w:t xml:space="preserve">  —  Herndon, VA</w:t>
       </w:r>
       <w:r>
         <w:rPr>
@@ -533,39 +356,7 @@
           <w:sz w:val="19"/>
           <w:szCs w:val="19"/>
         </w:rPr>
-        <w:t xml:space="preserve">Developed contact segmentation strategies by </w:t>
-      </w:r>
-      <w:proofErr w:type="spellStart"/>
-      <w:r>
-        <w:rPr>
-          <w:sz w:val="19"/>
-          <w:szCs w:val="19"/>
-        </w:rPr>
-        <w:t>analyzing</w:t>
-      </w:r>
-      <w:proofErr w:type="spellEnd"/>
-      <w:r>
-        <w:rPr>
-          <w:sz w:val="19"/>
-          <w:szCs w:val="19"/>
-        </w:rPr>
-        <w:t xml:space="preserve"> clickstream and </w:t>
-      </w:r>
-      <w:proofErr w:type="spellStart"/>
-      <w:r>
-        <w:rPr>
-          <w:sz w:val="19"/>
-          <w:szCs w:val="19"/>
-        </w:rPr>
-        <w:t>behavioral</w:t>
-      </w:r>
-      <w:proofErr w:type="spellEnd"/>
-      <w:r>
-        <w:rPr>
-          <w:sz w:val="19"/>
-          <w:szCs w:val="19"/>
-        </w:rPr>
-        <w:t xml:space="preserve"> data; identified that webinars drove 78% of total leads, enabling more targeted campaign strategy and resource allocation.</w:t>
+        <w:t>Developed contact segmentation strategies by analyzing clickstream and behavioral data; identified that webinars drove 78% of total leads, enabling more targeted campaign strategy and resource allocation.</w:t>
       </w:r>
     </w:p>
     <w:p>
@@ -633,17 +424,7 @@
           <w:sz w:val="21"/>
           <w:szCs w:val="21"/>
         </w:rPr>
-        <w:t xml:space="preserve">Business Analyst – Capstone </w:t>
-      </w:r>
-      <w:proofErr w:type="gramStart"/>
-      <w:r>
-        <w:rPr>
-          <w:b/>
-          <w:bCs/>
-          <w:sz w:val="21"/>
-          <w:szCs w:val="21"/>
-        </w:rPr>
-        <w:t>Consultant</w:t>
+        <w:t>Business Analyst – Capstone Consultant</w:t>
       </w:r>
       <w:r>
         <w:rPr>
@@ -651,16 +432,7 @@
           <w:sz w:val="21"/>
           <w:szCs w:val="21"/>
         </w:rPr>
-        <w:t xml:space="preserve">  |</w:t>
-      </w:r>
-      <w:proofErr w:type="gramEnd"/>
-      <w:r>
-        <w:rPr>
-          <w:color w:val="888888"/>
-          <w:sz w:val="21"/>
-          <w:szCs w:val="21"/>
-        </w:rPr>
-        <w:t xml:space="preserve">  </w:t>
+        <w:t xml:space="preserve">  |  </w:t>
       </w:r>
       <w:r>
         <w:rPr>
@@ -670,31 +442,13 @@
           <w:sz w:val="21"/>
           <w:szCs w:val="21"/>
         </w:rPr>
-        <w:t xml:space="preserve">Yonder </w:t>
-      </w:r>
-      <w:proofErr w:type="gramStart"/>
-      <w:r>
-        <w:rPr>
-          <w:b/>
-          <w:bCs/>
-          <w:color w:val="1A5276"/>
-          <w:sz w:val="21"/>
-          <w:szCs w:val="21"/>
-        </w:rPr>
-        <w:t>Talent</w:t>
+        <w:t>Yonder Talent</w:t>
       </w:r>
       <w:r>
         <w:rPr>
           <w:color w:val="555555"/>
         </w:rPr>
-        <w:t xml:space="preserve">  —</w:t>
-      </w:r>
-      <w:proofErr w:type="gramEnd"/>
-      <w:r>
-        <w:rPr>
-          <w:color w:val="555555"/>
-        </w:rPr>
-        <w:t xml:space="preserve">  Tempe, AZ</w:t>
+        <w:t xml:space="preserve">  —  Tempe, AZ</w:t>
       </w:r>
       <w:r>
         <w:rPr>
@@ -739,23 +493,7 @@
           <w:sz w:val="19"/>
           <w:szCs w:val="19"/>
         </w:rPr>
-        <w:t xml:space="preserve">Built predictive models (regression, SARIMA, </w:t>
-      </w:r>
-      <w:proofErr w:type="spellStart"/>
-      <w:r>
-        <w:rPr>
-          <w:sz w:val="19"/>
-          <w:szCs w:val="19"/>
-        </w:rPr>
-        <w:t>XGBoost</w:t>
-      </w:r>
-      <w:proofErr w:type="spellEnd"/>
-      <w:r>
-        <w:rPr>
-          <w:sz w:val="19"/>
-          <w:szCs w:val="19"/>
-        </w:rPr>
-        <w:t>, Random Forest, clustering) to forecast staffing demand, achieving 90% peak-period coverage accuracy.</w:t>
+        <w:t>Built predictive models (regression, SARIMA, XGBoost, Random Forest, clustering) to forecast staffing demand, achieving 90% peak-period coverage accuracy.</w:t>
       </w:r>
     </w:p>
     <w:p>
@@ -829,43 +567,7 @@
           <w:sz w:val="19"/>
           <w:szCs w:val="19"/>
         </w:rPr>
-        <w:t xml:space="preserve">W.P. Carey School of Business, Arizona State </w:t>
-      </w:r>
-      <w:proofErr w:type="gramStart"/>
-      <w:r>
-        <w:rPr>
-          <w:color w:val="555555"/>
-          <w:sz w:val="19"/>
-          <w:szCs w:val="19"/>
-        </w:rPr>
-        <w:t>University  |</w:t>
-      </w:r>
-      <w:proofErr w:type="gramEnd"/>
-      <w:r>
-        <w:rPr>
-          <w:color w:val="555555"/>
-          <w:sz w:val="19"/>
-          <w:szCs w:val="19"/>
-        </w:rPr>
-        <w:t xml:space="preserve">  Tempe, </w:t>
-      </w:r>
-      <w:proofErr w:type="gramStart"/>
-      <w:r>
-        <w:rPr>
-          <w:color w:val="555555"/>
-          <w:sz w:val="19"/>
-          <w:szCs w:val="19"/>
-        </w:rPr>
-        <w:t>AZ  |</w:t>
-      </w:r>
-      <w:proofErr w:type="gramEnd"/>
-      <w:r>
-        <w:rPr>
-          <w:color w:val="555555"/>
-          <w:sz w:val="19"/>
-          <w:szCs w:val="19"/>
-        </w:rPr>
-        <w:t xml:space="preserve">  GPA: 3.76</w:t>
+        <w:t>W.P. Carey School of Business, Arizona State University  |  Tempe, AZ  |  GPA: 3.76</w:t>
       </w:r>
     </w:p>
     <w:p>
@@ -909,43 +611,7 @@
           <w:sz w:val="19"/>
           <w:szCs w:val="19"/>
         </w:rPr>
-        <w:t xml:space="preserve">GITAM Institute of Management, GITAM </w:t>
-      </w:r>
-      <w:proofErr w:type="gramStart"/>
-      <w:r>
-        <w:rPr>
-          <w:color w:val="555555"/>
-          <w:sz w:val="19"/>
-          <w:szCs w:val="19"/>
-        </w:rPr>
-        <w:t>University  |</w:t>
-      </w:r>
-      <w:proofErr w:type="gramEnd"/>
-      <w:r>
-        <w:rPr>
-          <w:color w:val="555555"/>
-          <w:sz w:val="19"/>
-          <w:szCs w:val="19"/>
-        </w:rPr>
-        <w:t xml:space="preserve">  </w:t>
-      </w:r>
-      <w:proofErr w:type="gramStart"/>
-      <w:r>
-        <w:rPr>
-          <w:color w:val="555555"/>
-          <w:sz w:val="19"/>
-          <w:szCs w:val="19"/>
-        </w:rPr>
-        <w:t>India  |</w:t>
-      </w:r>
-      <w:proofErr w:type="gramEnd"/>
-      <w:r>
-        <w:rPr>
-          <w:color w:val="555555"/>
-          <w:sz w:val="19"/>
-          <w:szCs w:val="19"/>
-        </w:rPr>
-        <w:t xml:space="preserve">  GPA: 3.44</w:t>
+        <w:t>GITAM Institute of Management, GITAM University  |  India  |  GPA: 3.44</w:t>
       </w:r>
     </w:p>
     <w:p>
@@ -1039,17 +705,8 @@
                 <w:sz w:val="19"/>
                 <w:szCs w:val="19"/>
               </w:rPr>
-              <w:t xml:space="preserve">Excel (VLOOKUP, XLOOKUP, PivotTables, Macros), Google Sheets, Looker, Power BI, Tableau, </w:t>
+              <w:t>Excel (VLOOKUP, XLOOKUP, PivotTables, Macros), Google Sheets, Looker, Power BI, Tableau, QuickSight</w:t>
             </w:r>
-            <w:proofErr w:type="spellStart"/>
-            <w:r>
-              <w:rPr>
-                <w:sz w:val="19"/>
-                <w:szCs w:val="19"/>
-              </w:rPr>
-              <w:t>QuickSight</w:t>
-            </w:r>
-            <w:proofErr w:type="spellEnd"/>
           </w:p>
         </w:tc>
       </w:tr>
@@ -1105,23 +762,7 @@
                 <w:sz w:val="19"/>
                 <w:szCs w:val="19"/>
               </w:rPr>
-              <w:t>SQL, PostgreSQL, Python, R (</w:t>
-            </w:r>
-            <w:proofErr w:type="spellStart"/>
-            <w:r>
-              <w:rPr>
-                <w:sz w:val="19"/>
-                <w:szCs w:val="19"/>
-              </w:rPr>
-              <w:t>tidyverse</w:t>
-            </w:r>
-            <w:proofErr w:type="spellEnd"/>
-            <w:r>
-              <w:rPr>
-                <w:sz w:val="19"/>
-                <w:szCs w:val="19"/>
-              </w:rPr>
-              <w:t>, ggplot2), Databricks, Amazon S3</w:t>
+              <w:t>SQL, PostgreSQL, Python, R (tidyverse, ggplot2), Databricks, Amazon S3</w:t>
             </w:r>
           </w:p>
         </w:tc>

</xml_diff>